<commit_message>
Minor corrections from word difference analysis (Overview,Common,MX).
</commit_message>
<xml_diff>
--- a/dist/docx/overview.docx
+++ b/dist/docx/overview.docx
@@ -1913,7 +1913,11 @@
             </w:tr>
             <w:tr>
               <w:tc>
-                <w:p/>
+                <w:p>
+                  <w:r>
+                    <w:t>1</w:t>
+                  </w:r>
+                </w:p>
               </w:tc>
               <w:tc>
                 <w:p>
@@ -1932,7 +1936,11 @@
             </w:tr>
             <w:tr>
               <w:tc>
-                <w:p/>
+                <w:p>
+                  <w:r>
+                    <w:t>2</w:t>
+                  </w:r>
+                </w:p>
               </w:tc>
               <w:tc>
                 <w:p>
@@ -1974,7 +1982,11 @@
             </w:tr>
             <w:tr>
               <w:tc>
-                <w:p/>
+                <w:p>
+                  <w:r>
+                    <w:t>4</w:t>
+                  </w:r>
+                </w:p>
               </w:tc>
               <w:tc>
                 <w:p>
@@ -1984,7 +1996,7 @@
                 </w:p>
                 <w:p>
                   <w:r>
-                    <w:t>settles the HVCS payment by debiting the instructing agent's settlement account andcrediting the instructed agent's settlement account with the amount of the HVCS payment; and</w:t>
+                    <w:t>settles the HVCS payment by debiting the instructing agent's settlement account and crediting the instructed agent's settlement account with the amount of the HVCS payment; and</w:t>
                   </w:r>
                 </w:p>
                 <w:p>
@@ -3226,7 +3238,11 @@
             </w:tr>
             <w:tr>
               <w:tc>
-                <w:p/>
+                <w:p>
+                  <w:r>
+                    <w:t>1</w:t>
+                  </w:r>
+                </w:p>
               </w:tc>
               <w:tc>
                 <w:p>
@@ -3238,7 +3254,11 @@
             </w:tr>
             <w:tr>
               <w:tc>
-                <w:p/>
+                <w:p>
+                  <w:r>
+                    <w:t>2</w:t>
+                  </w:r>
+                </w:p>
               </w:tc>
               <w:tc>
                 <w:p>
@@ -3255,7 +3275,11 @@
             </w:tr>
             <w:tr>
               <w:tc>
-                <w:p/>
+                <w:p>
+                  <w:r>
+                    <w:t>3</w:t>
+                  </w:r>
+                </w:p>
               </w:tc>
               <w:tc>
                 <w:p>
@@ -3272,7 +3296,11 @@
             </w:tr>
             <w:tr>
               <w:tc>
-                <w:p/>
+                <w:p>
+                  <w:r>
+                    <w:t>4</w:t>
+                  </w:r>
+                </w:p>
               </w:tc>
               <w:tc>
                 <w:p>
@@ -3287,6 +3315,14 @@
         </w:tc>
       </w:tr>
     </w:tbl>
+    <w:p>
+      <w:pPr>
+        <w:pStyle w:val="Heading2"/>
+      </w:pPr>
+      <w:r>
+        <w:t>Customer credit transfer (non-SCP)</w:t>
+      </w:r>
+    </w:p>
     <w:tbl>
       <w:tblPr>
         <w:tblW w:type="dxa" w:w="9638"/>
@@ -3463,7 +3499,11 @@
             </w:tr>
             <w:tr>
               <w:tc>
-                <w:p/>
+                <w:p>
+                  <w:r>
+                    <w:t>1</w:t>
+                  </w:r>
+                </w:p>
               </w:tc>
               <w:tc>
                 <w:p>
@@ -3475,7 +3515,11 @@
             </w:tr>
             <w:tr>
               <w:tc>
-                <w:p/>
+                <w:p>
+                  <w:r>
+                    <w:t>2</w:t>
+                  </w:r>
+                </w:p>
               </w:tc>
               <w:tc>
                 <w:p>
@@ -3492,7 +3536,11 @@
             </w:tr>
             <w:tr>
               <w:tc>
-                <w:p/>
+                <w:p>
+                  <w:r>
+                    <w:t>3</w:t>
+                  </w:r>
+                </w:p>
               </w:tc>
               <w:tc>
                 <w:p>
@@ -3504,7 +3552,11 @@
             </w:tr>
             <w:tr>
               <w:tc>
-                <w:p/>
+                <w:p>
+                  <w:r>
+                    <w:t>4</w:t>
+                  </w:r>
+                </w:p>
               </w:tc>
               <w:tc>
                 <w:p>
@@ -3521,7 +3573,11 @@
             </w:tr>
             <w:tr>
               <w:tc>
-                <w:p/>
+                <w:p>
+                  <w:r>
+                    <w:t>5</w:t>
+                  </w:r>
+                </w:p>
               </w:tc>
               <w:tc>
                 <w:p>
@@ -3701,7 +3757,11 @@
       </w:tr>
       <w:tr>
         <w:tc>
-          <w:p/>
+          <w:p>
+            <w:r>
+              <w:t>1</w:t>
+            </w:r>
+          </w:p>
         </w:tc>
         <w:tc>
           <w:p>
@@ -3740,7 +3800,11 @@
       </w:tr>
       <w:tr>
         <w:tc>
-          <w:p/>
+          <w:p>
+            <w:r>
+              <w:t>2</w:t>
+            </w:r>
+          </w:p>
         </w:tc>
         <w:tc>
           <w:p>
@@ -3752,7 +3816,11 @@
       </w:tr>
       <w:tr>
         <w:tc>
-          <w:p/>
+          <w:p>
+            <w:r>
+              <w:t>3</w:t>
+            </w:r>
+          </w:p>
         </w:tc>
         <w:tc>
           <w:p>
@@ -3764,7 +3832,11 @@
       </w:tr>
       <w:tr>
         <w:tc>
-          <w:p/>
+          <w:p>
+            <w:r>
+              <w:t>4</w:t>
+            </w:r>
+          </w:p>
         </w:tc>
         <w:tc>
           <w:p>
@@ -3776,7 +3848,11 @@
       </w:tr>
       <w:tr>
         <w:tc>
-          <w:p/>
+          <w:p>
+            <w:r>
+              <w:t>5</w:t>
+            </w:r>
+          </w:p>
         </w:tc>
         <w:tc>
           <w:p>
@@ -3946,7 +4022,11 @@
       </w:tr>
       <w:tr>
         <w:tc>
-          <w:p/>
+          <w:p>
+            <w:r>
+              <w:t>1</w:t>
+            </w:r>
+          </w:p>
         </w:tc>
         <w:tc>
           <w:p>
@@ -3958,7 +4038,11 @@
       </w:tr>
       <w:tr>
         <w:tc>
-          <w:p/>
+          <w:p>
+            <w:r>
+              <w:t>2</w:t>
+            </w:r>
+          </w:p>
         </w:tc>
         <w:tc>
           <w:p>
@@ -3992,7 +4076,11 @@
       </w:tr>
       <w:tr>
         <w:tc>
-          <w:p/>
+          <w:p>
+            <w:r>
+              <w:t>3</w:t>
+            </w:r>
+          </w:p>
         </w:tc>
         <w:tc>
           <w:p>
@@ -4004,7 +4092,11 @@
       </w:tr>
       <w:tr>
         <w:tc>
-          <w:p/>
+          <w:p>
+            <w:r>
+              <w:t>4</w:t>
+            </w:r>
+          </w:p>
         </w:tc>
         <w:tc>
           <w:p>
@@ -4016,7 +4108,11 @@
       </w:tr>
       <w:tr>
         <w:tc>
-          <w:p/>
+          <w:p>
+            <w:r>
+              <w:t>5</w:t>
+            </w:r>
+          </w:p>
         </w:tc>
         <w:tc>
           <w:p>
@@ -4028,7 +4124,11 @@
       </w:tr>
       <w:tr>
         <w:tc>
-          <w:p/>
+          <w:p>
+            <w:r>
+              <w:t>6</w:t>
+            </w:r>
+          </w:p>
         </w:tc>
         <w:tc>
           <w:p>
@@ -4371,7 +4471,11 @@
       </w:tr>
       <w:tr>
         <w:tc>
-          <w:p/>
+          <w:p>
+            <w:r>
+              <w:t>1</w:t>
+            </w:r>
+          </w:p>
         </w:tc>
         <w:tc>
           <w:p>
@@ -4383,7 +4487,11 @@
       </w:tr>
       <w:tr>
         <w:tc>
-          <w:p/>
+          <w:p>
+            <w:r>
+              <w:t>2</w:t>
+            </w:r>
+          </w:p>
         </w:tc>
         <w:tc>
           <w:p>
@@ -4395,7 +4503,11 @@
       </w:tr>
       <w:tr>
         <w:tc>
-          <w:p/>
+          <w:p>
+            <w:r>
+              <w:t>3</w:t>
+            </w:r>
+          </w:p>
         </w:tc>
         <w:tc>
           <w:p>
@@ -4407,7 +4519,11 @@
       </w:tr>
       <w:tr>
         <w:tc>
-          <w:p/>
+          <w:p>
+            <w:r>
+              <w:t>4</w:t>
+            </w:r>
+          </w:p>
         </w:tc>
         <w:tc>
           <w:p>
@@ -4419,7 +4535,11 @@
       </w:tr>
       <w:tr>
         <w:tc>
-          <w:p/>
+          <w:p>
+            <w:r>
+              <w:t>5</w:t>
+            </w:r>
+          </w:p>
         </w:tc>
         <w:tc>
           <w:p>
@@ -4682,29 +4802,6 @@
               </w:numPr>
             </w:pPr>
             <w:r>
-              <w:t>UG2025</w:t>
-            </w:r>
-            <w:r>
-              <w:t xml:space="preserve"> </w:t>
-            </w:r>
-            <w:r>
-              <w:t>RK</w:t>
-            </w:r>
-            <w:r>
-              <w:t xml:space="preserve"> </w:t>
-            </w:r>
-            <w:r>
-              <w:t>Removed refereence to 'or SWIFT NetCopy'</w:t>
-            </w:r>
-          </w:p>
-          <w:p>
-            <w:pPr>
-              <w:numPr>
-                <w:ilvl w:val="0"/>
-                <w:numId w:val="200"/>
-              </w:numPr>
-            </w:pPr>
-            <w:r>
               <w:t>the service parameters for the SWIFT FINCopy service.</w:t>
             </w:r>
           </w:p>
@@ -5563,7 +5660,7 @@
               </w:numPr>
             </w:pPr>
             <w:r>
-              <w:t>is important to be familiar with the terminology used in MX messaging Technical Terms for a definition of the terms below.</w:t>
+              <w:t>It is important to be familiar with the terminology used in MX messaging Technical Terms for a definition of the terms below.</w:t>
             </w:r>
           </w:p>
         </w:tc>
@@ -5621,7 +5718,11 @@
       </w:tr>
       <w:tr>
         <w:tc>
-          <w:p/>
+          <w:p>
+            <w:r>
+              <w:t>1</w:t>
+            </w:r>
+          </w:p>
         </w:tc>
         <w:tc>
           <w:p>
@@ -5640,7 +5741,11 @@
       </w:tr>
       <w:tr>
         <w:tc>
-          <w:p/>
+          <w:p>
+            <w:r>
+              <w:t>2</w:t>
+            </w:r>
+          </w:p>
         </w:tc>
         <w:tc>
           <w:p>
@@ -5659,7 +5764,11 @@
       </w:tr>
       <w:tr>
         <w:tc>
-          <w:p/>
+          <w:p>
+            <w:r>
+              <w:t>3</w:t>
+            </w:r>
+          </w:p>
         </w:tc>
         <w:tc>
           <w:p>
@@ -5678,7 +5787,11 @@
       </w:tr>
       <w:tr>
         <w:tc>
-          <w:p/>
+          <w:p>
+            <w:r>
+              <w:t>4</w:t>
+            </w:r>
+          </w:p>
         </w:tc>
         <w:tc>
           <w:p>
@@ -5697,7 +5810,11 @@
       </w:tr>
       <w:tr>
         <w:tc>
-          <w:p/>
+          <w:p>
+            <w:r>
+              <w:t>5</w:t>
+            </w:r>
+          </w:p>
         </w:tc>
         <w:tc>
           <w:p>
@@ -5716,7 +5833,11 @@
       </w:tr>
       <w:tr>
         <w:tc>
-          <w:p/>
+          <w:p>
+            <w:r>
+              <w:t>6</w:t>
+            </w:r>
+          </w:p>
         </w:tc>
         <w:tc>
           <w:p>
@@ -5735,7 +5856,11 @@
       </w:tr>
       <w:tr>
         <w:tc>
-          <w:p/>
+          <w:p>
+            <w:r>
+              <w:t>7</w:t>
+            </w:r>
+          </w:p>
         </w:tc>
         <w:tc>
           <w:p>
@@ -5754,7 +5879,11 @@
       </w:tr>
       <w:tr>
         <w:tc>
-          <w:p/>
+          <w:p>
+            <w:r>
+              <w:t>8</w:t>
+            </w:r>
+          </w:p>
         </w:tc>
         <w:tc>
           <w:p>
@@ -5773,7 +5902,11 @@
       </w:tr>
       <w:tr>
         <w:tc>
-          <w:p/>
+          <w:p>
+            <w:r>
+              <w:t>9</w:t>
+            </w:r>
+          </w:p>
         </w:tc>
         <w:tc>
           <w:p>
@@ -5935,29 +6068,6 @@
             </w:pPr>
             <w:r>
               <w:t>Financial Markets Infrastructure Act 2021, which is likely to impose standards on HVCS (as a designated FMI) which could cover clearing and settlement requirements;</w:t>
-            </w:r>
-          </w:p>
-          <w:p>
-            <w:pPr>
-              <w:numPr>
-                <w:ilvl w:val="0"/>
-                <w:numId w:val="200"/>
-              </w:numPr>
-            </w:pPr>
-            <w:r>
-              <w:t>UG2025</w:t>
-            </w:r>
-            <w:r>
-              <w:t xml:space="preserve"> </w:t>
-            </w:r>
-            <w:r>
-              <w:t>MT</w:t>
-            </w:r>
-            <w:r>
-              <w:t xml:space="preserve"> </w:t>
-            </w:r>
-            <w:r>
-              <w:t>Added next two examples.</w:t>
             </w:r>
           </w:p>
           <w:p>

</xml_diff>